<commit_message>
chore: refresh kbs final submission package
</commit_message>
<xml_diff>
--- a/paper/kbs_submission/final_package/cover_letter.docx
+++ b/paper/kbs_submission/final_package/cover_letter.docx
@@ -20,7 +20,7 @@
         <w:spacing w:after="240"/>
       </w:pPr>
       <w:r>
-        <w:t>June 15, 2026</w:t>
+        <w:t>June 16, 2026</w:t>
       </w:r>
     </w:p>
     <w:p>
@@ -66,7 +66,7 @@
         <w:jc w:val="left"/>
       </w:pPr>
       <w:r>
-        <w:t>The manuscript presents Structurally-Calibrated Functional Attribution (SC-FMA), a method for auditable verification-step weighting in knowledge-intensive reasoning systems. The work connects intervention-sensitive utility estimates with graph-level structural necessity, redundancy, and bottleneck protection through a convex calibration objective.</w:t>
+        <w:t>The manuscript presents Structurally-Calibrated Functional Attribution (SC-FMA), a method for auditable verification-step weighting in knowledge-intensive reasoning systems.</w:t>
       </w:r>
     </w:p>
     <w:p>
@@ -74,7 +74,7 @@
         <w:jc w:val="left"/>
       </w:pPr>
       <w:r>
-        <w:t>We believe the manuscript fits Knowledge-Based Systems because it treats process supervision as a knowledge-structured verification problem rather than as generic token attribution or process-reward tuning. The submission is claim-bounded: synthetic experiments and locked PRM800K step-label evidence support the calibration methodology, while GSM8K/HotpotQA replay and downstream filtering routes are retained only as failed or blocked validation provenance. The Countries KG study is presented only as a pilot for ontology-aware edge construction, not as a deployed KBS validation.</w:t>
+        <w:t>We believe it fits Knowledge-Based Systems because it treats process supervision as a knowledge-structured decision-support problem: verification steps are weighted not only by local utility, but also by graph dependencies, redundancy, and bottleneck roles.</w:t>
       </w:r>
     </w:p>
     <w:p>
@@ -82,7 +82,15 @@
         <w:jc w:val="left"/>
       </w:pPr>
       <w:r>
-        <w:t>This work was supported by the National Social Science Fund of China Project (24BSH018) and the Beijing Natural Science Foundation Project (L252145). The authors declared that they have no conflicts of interest to this work. Data will be made available on request.</w:t>
+        <w:t>The evidence package includes a controlled synthetic benchmark where the QP variant is strongest, locked PRM800K step-label evidence where w_struct is the primary real-data signal and Ridge is the closest SC-FMA approximation, and a new offline PRM800K audit-prioritization readout for fixed review budgets. The claim boundary is explicit: the submission does not claim downstream PRM training gains, GSM8K/HotpotQA replay validation, out-of-distribution transfer, or deployed knowledge-base workflow validation.</w:t>
+      </w:r>
+    </w:p>
+    <w:p>
+      <w:pPr>
+        <w:jc w:val="left"/>
+      </w:pPr>
+      <w:r>
+        <w:t>This work was supported by the National Social Science Fund of China Project (24BSH018) and the Beijing Natural Science Foundation Project (L252145). The authors declared that they have no conflicts of interest to this work. PRM800K is publicly available from its original source; derived reports and reproduction artifacts will be made available by the authors on request.</w:t>
       </w:r>
     </w:p>
     <w:p>
@@ -95,18 +103,10 @@
     </w:p>
     <w:p>
       <w:pPr>
-        <w:jc w:val="left"/>
+        <w:spacing w:before="240" w:after="120"/>
       </w:pPr>
       <w:r>
         <w:t>Thank you for considering our submission.</w:t>
-      </w:r>
-    </w:p>
-    <w:p>
-      <w:pPr>
-        <w:spacing w:before="240" w:after="120"/>
-      </w:pPr>
-      <w:r>
-        <w:t>Sincerely,</w:t>
       </w:r>
     </w:p>
     <w:p>

</xml_diff>